<commit_message>
Fill Korman LLC client details and remove hour estimates
- Client: Korman LLC, 5783 W Erie St, Chandler, AZ 85226
- Retainer set to $3,000
- Letter date set to July 1, 2026
- Removed the Time estimates section ([hours] tables); reworded the fee
  paragraph so it no longer references the removed estimates

Co-Authored-By: Claude Opus 4.8 <noreply@anthropic.com>
Claude-Session: https://claude.ai/code/session_01RfN2m1kgBo1xCWLXRNw2zV
</commit_message>
<xml_diff>
--- a/Onyx_Engagement_Letter_Korer_HOURLY.docx
+++ b/Onyx_Engagement_Letter_Korer_HOURLY.docx
@@ -179,7 +179,7 @@
         <w:rPr>
           <w:noProof/>
         </w:rPr>
-        <w:t>[Date of letter]</w:t>
+        <w:t>July 1, 2026</w:t>
       </w:r>
       <w:r>
         <w:fldChar w:fldCharType="end"/>
@@ -245,7 +245,7 @@
           <w:noProof/>
           <w:color w:val="auto"/>
         </w:rPr>
-        <w:t>[CLIENT LEGAL NAME]</w:t>
+        <w:t>Korman LLC</w:t>
       </w:r>
       <w:r>
         <w:rPr>
@@ -411,7 +411,7 @@
         <w:rPr>
           <w:noProof/>
         </w:rPr>
-        <w:t>[Date]</w:t>
+        <w:t>July 1, 2026</w:t>
       </w:r>
       <w:r>
         <w:fldChar w:fldCharType="end"/>
@@ -453,7 +453,7 @@
         <w:rPr>
           <w:noProof/>
         </w:rPr>
-        <w:t>[CLIENT LEGAL NAME]</w:t>
+        <w:t>Korman LLC</w:t>
       </w:r>
       <w:r>
         <w:fldChar w:fldCharType="end"/>
@@ -465,7 +465,7 @@
         <w:pStyle w:val="CLALTRAddressorSignature"/>
       </w:pPr>
       <w:r>
-        <w:t>[Street address]</w:t>
+        <w:t>5783 W ERIE ST</w:t>
       </w:r>
       <w:bookmarkStart w:id="3" w:name="Text11"/>
       <w:bookmarkEnd w:id="3"/>
@@ -475,7 +475,7 @@
         <w:pStyle w:val="CLALTRAddressorSignature"/>
       </w:pPr>
       <w:r>
-        <w:t>Chandler, AZ [ZIP]</w:t>
+        <w:t>Chandler, AZ 85226</w:t>
       </w:r>
       <w:bookmarkStart w:id="4" w:name="Text12"/>
       <w:bookmarkEnd w:id="4"/>
@@ -588,7 +588,7 @@
         <w:rPr>
           <w:noProof/>
         </w:rPr>
-        <w:t>[CLIENT LEGAL NAME]</w:t>
+        <w:t>Korman LLC</w:t>
       </w:r>
       <w:r>
         <w:fldChar w:fldCharType="end"/>
@@ -1689,485 +1689,12 @@
     </w:p>
     <w:p>
       <w:pPr>
-        <w:pStyle w:val="CLALTRHeading2"/>
-        <w:jc w:val="both"/>
-      </w:pPr>
-      <w:r>
-        <w:t>Time estimates:</w:t>
-      </w:r>
-    </w:p>
-    <w:p>
-      <w:pPr>
-        <w:pStyle w:val="CLALTRHeading2"/>
-        <w:jc w:val="both"/>
-      </w:pPr>
-      <w:r>
-        <w:rPr>
-          <w:b w:val="0"/>
-          <w:u w:val="single"/>
-        </w:rPr>
-        <w:t xml:space="preserve">Initial project services (anticipated to last </w:t>
-      </w:r>
-      <w:r>
-        <w:rPr>
-          <w:b w:val="0"/>
-          <w:u w:val="single"/>
-        </w:rPr>
-        <w:t>three to four</w:t>
-      </w:r>
-      <w:r>
-        <w:rPr>
-          <w:b w:val="0"/>
-          <w:u w:val="single"/>
-        </w:rPr>
-        <w:t xml:space="preserve"> weeks):</w:t>
-      </w:r>
-      <w:r>
-        <w:t xml:space="preserve"> </w:t>
-      </w:r>
-      <w:r>
-        <w:rPr>
-          <w:rStyle w:val="CLALTRHiddenTextChar"/>
-          <w:b/>
-          <w:i/>
-        </w:rPr>
-        <w:t/>
-      </w:r>
-    </w:p>
-    <w:p>
-      <w:pPr>
-        <w:pStyle w:val="CLALTRNormal"/>
-        <w:numPr>
-          <w:ilvl w:val="0"/>
-          <w:numId w:val="14"/>
-        </w:numPr>
-        <w:jc w:val="both"/>
-      </w:pPr>
-      <w:r>
-        <w:rPr/>
-        <w:t>Services performed by Staff Accountant</w:t>
-      </w:r>
-      <w:r>
-        <w:rPr/>
-        <w:tab/>
-      </w:r>
-      <w:r>
-        <w:rPr/>
-        <w:tab/>
-      </w:r>
-      <w:r>
-        <w:rPr/>
-        <w:tab/>
-      </w:r>
-      <w:r>
-        <w:rPr/>
-        <w:tab/>
-      </w:r>
-      <w:r>
-        <w:rPr/>
-        <w:tab/>
-      </w:r>
-      <w:r>
-        <w:rPr/>
-        <w:tab/>
-      </w:r>
-      <w:r>
-        <w:fldChar w:fldCharType="begin">
-          <w:ffData>
-            <w:name w:val="Text49"/>
-            <w:enabled/>
-            <w:calcOnExit w:val="0"/>
-            <w:textInput>
-              <w:default w:val="[hours]"/>
-            </w:textInput>
-          </w:ffData>
-        </w:fldChar>
-      </w:r>
-      <w:r>
-        <w:instrText xml:space="preserve"> FORMTEXT </w:instrText>
-      </w:r>
-      <w:r>
-        <w:fldChar w:fldCharType="separate"/>
-      </w:r>
-      <w:r>
-        <w:rPr>
-          <w:noProof/>
-        </w:rPr>
-        <w:t>[hours]</w:t>
-      </w:r>
-      <w:r>
-        <w:fldChar w:fldCharType="end"/>
-      </w:r>
-      <w:r>
-        <w:rPr/>
-        <w:t xml:space="preserve"> hours per week</w:t>
-      </w:r>
-    </w:p>
-    <w:p>
-      <w:pPr>
-        <w:pStyle w:val="CLALTRNormal"/>
-        <w:numPr>
-          <w:ilvl w:val="0"/>
-          <w:numId w:val="14"/>
-        </w:numPr>
-        <w:jc w:val="both"/>
-      </w:pPr>
-      <w:r>
-        <w:rPr/>
-        <w:t>Services performed by Controller</w:t>
-      </w:r>
-      <w:r>
-        <w:rPr/>
-        <w:tab/>
-      </w:r>
-      <w:r>
-        <w:rPr/>
-        <w:tab/>
-      </w:r>
-      <w:r>
-        <w:rPr/>
-        <w:tab/>
-      </w:r>
-      <w:r>
-        <w:rPr/>
-        <w:tab/>
-      </w:r>
-      <w:r>
-        <w:rPr/>
-        <w:tab/>
-      </w:r>
-      <w:r>
-        <w:fldChar w:fldCharType="begin">
-          <w:ffData>
-            <w:name w:val="Text49"/>
-            <w:enabled/>
-            <w:calcOnExit w:val="0"/>
-            <w:textInput>
-              <w:default w:val="[hours]"/>
-            </w:textInput>
-          </w:ffData>
-        </w:fldChar>
-      </w:r>
-      <w:r>
-        <w:instrText xml:space="preserve"> FORMTEXT </w:instrText>
-      </w:r>
-      <w:r>
-        <w:fldChar w:fldCharType="separate"/>
-      </w:r>
-      <w:r>
-        <w:rPr>
-          <w:noProof/>
-        </w:rPr>
-        <w:t>[hours]</w:t>
-      </w:r>
-      <w:r>
-        <w:fldChar w:fldCharType="end"/>
-      </w:r>
-      <w:r>
-        <w:rPr/>
-        <w:t xml:space="preserve"> hours per week</w:t>
-      </w:r>
-    </w:p>
-    <w:p>
-      <w:pPr>
-        <w:pStyle w:val="CLALTRNormal"/>
-        <w:numPr>
-          <w:ilvl w:val="0"/>
-          <w:numId w:val="14"/>
-        </w:numPr>
-        <w:jc w:val="both"/>
-      </w:pPr>
-      <w:r>
-        <w:rPr/>
-        <w:t xml:space="preserve">Services performed by </w:t>
-      </w:r>
-      <w:r>
-        <w:fldChar w:fldCharType="begin">
-          <w:ffData>
-            <w:name w:val=""/>
-            <w:enabled/>
-            <w:calcOnExit w:val="0"/>
-            <w:textInput>
-              <w:default w:val="CFO"/>
-            </w:textInput>
-          </w:ffData>
-        </w:fldChar>
-      </w:r>
-      <w:r>
-        <w:instrText xml:space="preserve"> FORMTEXT </w:instrText>
-      </w:r>
-      <w:r>
-        <w:fldChar w:fldCharType="separate"/>
-      </w:r>
-      <w:r>
-        <w:rPr>
-          <w:noProof/>
-        </w:rPr>
-        <w:t>CFO</w:t>
-      </w:r>
-      <w:r>
-        <w:fldChar w:fldCharType="end"/>
-      </w:r>
-      <w:r>
-        <w:rPr/>
-        <w:t/>
-      </w:r>
-      <w:r>
-        <w:rPr/>
-        <w:tab/>
-      </w:r>
-      <w:r>
-        <w:rPr/>
-        <w:tab/>
-      </w:r>
-      <w:r>
-        <w:rPr/>
-        <w:t xml:space="preserve">     </w:t>
-      </w:r>
-      <w:r>
-        <w:rPr/>
-        <w:t>as requested or required</w:t>
-      </w:r>
-    </w:p>
-    <w:p>
-      <w:pPr>
-        <w:pStyle w:val="CLALTRHeading2"/>
-        <w:jc w:val="both"/>
-        <w:rPr>
-          <w:b w:val="0"/>
-          <w:u w:val="single"/>
-        </w:rPr>
-      </w:pPr>
-      <w:proofErr w:type="gramStart"/>
-      <w:r>
-        <w:rPr>
-          <w:b w:val="0"/>
-          <w:u w:val="single"/>
-        </w:rPr>
-        <w:t>Ongoing</w:t>
-      </w:r>
-      <w:proofErr w:type="gramEnd"/>
-      <w:r>
-        <w:rPr>
-          <w:b w:val="0"/>
-          <w:u w:val="single"/>
-        </w:rPr>
-        <w:t xml:space="preserve"> normal accounting services:</w:t>
-      </w:r>
-    </w:p>
-    <w:p>
-      <w:pPr>
-        <w:pStyle w:val="CLALTRNormal"/>
-        <w:numPr>
-          <w:ilvl w:val="0"/>
-          <w:numId w:val="15"/>
-        </w:numPr>
-        <w:jc w:val="both"/>
-      </w:pPr>
-      <w:r>
-        <w:rPr/>
-        <w:t>Services performed by Staff Accountant</w:t>
-      </w:r>
-      <w:r>
-        <w:rPr/>
-        <w:tab/>
-      </w:r>
-      <w:r>
-        <w:rPr/>
-        <w:tab/>
-      </w:r>
-      <w:r>
-        <w:rPr/>
-        <w:tab/>
-      </w:r>
-      <w:r>
-        <w:rPr/>
-        <w:tab/>
-      </w:r>
-      <w:proofErr w:type="gramStart"/>
-      <w:r>
-        <w:rPr/>
-        <w:tab/>
-        <w:t xml:space="preserve">  </w:t>
-      </w:r>
-      <w:r>
-        <w:rPr/>
-        <w:t>Estimated</w:t>
-      </w:r>
-      <w:proofErr w:type="gramEnd"/>
-      <w:r>
-        <w:rPr/>
-        <w:t xml:space="preserve"> </w:t>
-      </w:r>
-      <w:bookmarkStart w:id="7" w:name="Text49"/>
-      <w:r>
-        <w:fldChar w:fldCharType="begin">
-          <w:ffData>
-            <w:name w:val="Text49"/>
-            <w:enabled/>
-            <w:calcOnExit w:val="0"/>
-            <w:textInput>
-              <w:default w:val="[hours]"/>
-            </w:textInput>
-          </w:ffData>
-        </w:fldChar>
-      </w:r>
-      <w:r>
-        <w:instrText xml:space="preserve"> FORMTEXT </w:instrText>
-      </w:r>
-      <w:r>
-        <w:fldChar w:fldCharType="separate"/>
-      </w:r>
-      <w:r>
-        <w:rPr>
-          <w:noProof/>
-        </w:rPr>
-        <w:t>[hours]</w:t>
-      </w:r>
-      <w:r>
-        <w:fldChar w:fldCharType="end"/>
-      </w:r>
-      <w:bookmarkEnd w:id="7"/>
-      <w:r>
-        <w:rPr/>
-        <w:t xml:space="preserve"> hours per week</w:t>
-      </w:r>
-    </w:p>
-    <w:p>
-      <w:pPr>
-        <w:pStyle w:val="CLALTRNormal"/>
-        <w:numPr>
-          <w:ilvl w:val="0"/>
-          <w:numId w:val="15"/>
-        </w:numPr>
-        <w:jc w:val="both"/>
-      </w:pPr>
-      <w:r>
-        <w:rPr/>
-        <w:t>Services performed</w:t>
-      </w:r>
-      <w:r>
-        <w:rPr/>
-        <w:t xml:space="preserve"> by Controller</w:t>
-      </w:r>
-      <w:r>
-        <w:rPr/>
-        <w:tab/>
-      </w:r>
-      <w:r>
-        <w:rPr/>
-        <w:tab/>
-      </w:r>
-      <w:r>
-        <w:rPr/>
-        <w:tab/>
-      </w:r>
-      <w:r>
-        <w:rPr/>
-        <w:tab/>
-      </w:r>
-      <w:r>
-        <w:rPr/>
-        <w:t xml:space="preserve">Estimated </w:t>
-      </w:r>
-      <w:r>
-        <w:fldChar w:fldCharType="begin">
-          <w:ffData>
-            <w:name w:val="Text49"/>
-            <w:enabled/>
-            <w:calcOnExit w:val="0"/>
-            <w:textInput>
-              <w:default w:val="[hours]"/>
-            </w:textInput>
-          </w:ffData>
-        </w:fldChar>
-      </w:r>
-      <w:r>
-        <w:instrText xml:space="preserve"> FORMTEXT </w:instrText>
-      </w:r>
-      <w:r>
-        <w:fldChar w:fldCharType="separate"/>
-      </w:r>
-      <w:r>
-        <w:rPr>
-          <w:noProof/>
-        </w:rPr>
-        <w:t>[hours]</w:t>
-      </w:r>
-      <w:r>
-        <w:fldChar w:fldCharType="end"/>
-      </w:r>
-      <w:r>
-        <w:rPr/>
-        <w:t xml:space="preserve"> hours per month</w:t>
-      </w:r>
-    </w:p>
-    <w:p>
-      <w:pPr>
-        <w:pStyle w:val="CLALTRNormal"/>
-        <w:numPr>
-          <w:ilvl w:val="0"/>
-          <w:numId w:val="15"/>
-        </w:numPr>
-        <w:jc w:val="both"/>
-      </w:pPr>
-      <w:r>
-        <w:rPr/>
-        <w:t xml:space="preserve">Services performed by </w:t>
-      </w:r>
-      <w:r>
-        <w:fldChar w:fldCharType="begin">
-          <w:ffData>
-            <w:name w:val=""/>
-            <w:enabled/>
-            <w:calcOnExit w:val="0"/>
-            <w:textInput>
-              <w:default w:val="CFO"/>
-            </w:textInput>
-          </w:ffData>
-        </w:fldChar>
-      </w:r>
-      <w:r>
-        <w:instrText xml:space="preserve"> FORMTEXT </w:instrText>
-      </w:r>
-      <w:r>
-        <w:fldChar w:fldCharType="separate"/>
-      </w:r>
-      <w:r>
-        <w:rPr>
-          <w:noProof/>
-        </w:rPr>
-        <w:t>CFO</w:t>
-      </w:r>
-      <w:r>
-        <w:fldChar w:fldCharType="end"/>
-      </w:r>
-      <w:r>
-        <w:rPr/>
-        <w:t/>
-      </w:r>
-      <w:r>
-        <w:rPr/>
-        <w:tab/>
-      </w:r>
-      <w:r>
-        <w:rPr/>
-        <w:tab/>
-        <w:t xml:space="preserve">     </w:t>
-      </w:r>
-      <w:r>
-        <w:rPr/>
-        <w:t>as requested or required</w:t>
-      </w:r>
-    </w:p>
-    <w:p>
-      <w:pPr>
-        <w:pStyle w:val="CLALTRNormal"/>
-        <w:jc w:val="both"/>
-      </w:pPr>
-      <w:r>
-        <w:rPr/>
-        <w:t xml:space="preserve">Our fees for these services will be based on the time involved and the degree of responsibility and skill required, plus expenses, including internal and administrative charges. These estimates assume timely cooperation and assistance from the Client’s personnel in preparing requested schedules; if requested items are not available when needed or are inaccurate, the fee will likely be higher. Should unexpected circumstances require significant additional time, ONYX will advise the Client before undertaking any work that would substantially increase the fee estimate.</w:t>
+        <w:pStyle w:val="CLALTRNormal"/>
+        <w:jc w:val="both"/>
+      </w:pPr>
+      <w:r>
+        <w:rPr/>
+        <w:t>Our fees for these services will be based on the time involved and the degree of responsibility and skill required, plus expenses, including internal and administrative charges. Our fees assume timely cooperation and assistance from the Client’s personnel in preparing requested schedules; if requested items are not available when needed or are inaccurate, the fee will likely be higher. Should unexpected circumstances require significant additional time, ONYX will advise the Client before undertaking any work that would substantially increase the anticipated fees.</w:t>
       </w:r>
     </w:p>
     <w:p>
@@ -2584,7 +2111,7 @@
         <w:rPr>
           <w:noProof/>
         </w:rPr>
-        <w:t>[insert amount]</w:t>
+        <w:t>3,000</w:t>
       </w:r>
       <w:r>
         <w:rPr>
@@ -4401,7 +3928,7 @@
         <w:rPr>
           <w:noProof/>
         </w:rPr>
-        <w:t>[CLIENT LEGAL NAME]</w:t>
+        <w:t>Korman LLC</w:t>
       </w:r>
       <w:r>
         <w:fldChar w:fldCharType="end"/>

</xml_diff>

<commit_message>
Set Initial Period to FY2026 and add 2024/2025 catch-up work
- Engagement now starts in 2026 for the fiscal year ending December 31,
  2026, consistent with the July 1, 2026 letter date
- Added 2024/2025 catch-up and clean-up as an explicit initial-priority
  service (scope intro plus a dedicated scope bullet)

Co-Authored-By: Claude Opus 4.8 <noreply@anthropic.com>
Claude-Session: https://claude.ai/code/session_01RfN2m1kgBo1xCWLXRNw2zV
</commit_message>
<xml_diff>
--- a/Onyx_Engagement_Letter_Korer_HOURLY.docx
+++ b/Onyx_Engagement_Letter_Korer_HOURLY.docx
@@ -636,7 +636,7 @@
         <w:rPr>
           <w:noProof/>
         </w:rPr>
-        <w:t>2025</w:t>
+        <w:t>2026</w:t>
       </w:r>
       <w:r>
         <w:fldChar w:fldCharType="end"/>
@@ -682,7 +682,7 @@
         <w:rPr>
           <w:noProof/>
         </w:rPr>
-        <w:t>December 31, 2025</w:t>
+        <w:t>December 31, 2026</w:t>
       </w:r>
       <w:r>
         <w:fldChar w:fldCharType="end"/>
@@ -791,7 +791,7 @@
         <w:jc w:val="both"/>
       </w:pPr>
       <w:r>
-        <w:t>ONYX works as an extension of the Client’s accounting team — bringing controller-level oversight and review readiness without the cost and overhead of building it in-house. On a periodic basis (generally quarterly) and as otherwise needed or requested, ONYX supports the Client’s in-house bookkeeping, keeps the books in QuickBooks accurate and review-ready, helps stand up reporting by product line, and prepares the Client for its annual financial-statement review. The services below are illustrative of what ONYX provides and are not a fixed or exhaustive list; we tailor the mix to the Client’s needs and adjust it as those needs change.</w:t>
+        <w:t>ONYX works as an extension of the Client’s accounting team — bringing controller-level oversight and review readiness without the cost and overhead of building it in-house. On a periodic basis (generally quarterly) and as otherwise needed or requested, ONYX supports the Client’s in-house bookkeeping, keeps the books in QuickBooks accurate and review-ready, helps stand up reporting by product line, and prepares the Client for its annual financial-statement review. The services below are illustrative of what ONYX provides and are not a fixed or exhaustive list; we tailor the mix to the Client’s needs and adjust it as those needs change. As an initial priority, ONYX will also perform catch-up and clean-up work to bring the Client’s 2024 and 2025 books current and review-ready.</w:t>
       </w:r>
     </w:p>
     <w:p>
@@ -1050,6 +1050,20 @@
       <w:r>
         <w:rPr/>
         <w:t xml:space="preserve">Gather and organize everything the Client’s tax preparer needs for the annual return</w:t>
+      </w:r>
+    </w:p>
+    <w:p>
+      <w:pPr>
+        <w:pStyle w:val="CLALTRNormal"/>
+        <w:numPr>
+          <w:ilvl w:val="0"/>
+          <w:numId w:val="10"/>
+        </w:numPr>
+        <w:jc w:val="both"/>
+      </w:pPr>
+      <w:r>
+        <w:rPr/>
+        <w:t>Perform catch-up and clean-up accounting for the 2024 and 2025 periods to bring the books current and ready for review</w:t>
       </w:r>
     </w:p>
     <w:p>

</xml_diff>

<commit_message>
Reword 2024/2025 initial work to match transcript
Per the meeting, the 2024 holdup is producing reports/documentation to
finalize the review (not redoing the books), while 2025 is the catch-up.
Split the framing: 2024 = compile reports & documentation to finalize
the review; 2025 = catch-up and clean-up accounting.

Co-Authored-By: Claude Opus 4.8 <noreply@anthropic.com>
Claude-Session: https://claude.ai/code/session_01RfN2m1kgBo1xCWLXRNw2zV
</commit_message>
<xml_diff>
--- a/Onyx_Engagement_Letter_Korer_HOURLY.docx
+++ b/Onyx_Engagement_Letter_Korer_HOURLY.docx
@@ -791,7 +791,7 @@
         <w:jc w:val="both"/>
       </w:pPr>
       <w:r>
-        <w:t>ONYX works as an extension of the Client’s accounting team — bringing controller-level oversight and review readiness without the cost and overhead of building it in-house. On a periodic basis (generally quarterly) and as otherwise needed or requested, ONYX supports the Client’s in-house bookkeeping, keeps the books in QuickBooks accurate and review-ready, helps stand up reporting by product line, and prepares the Client for its annual financial-statement review. The services below are illustrative of what ONYX provides and are not a fixed or exhaustive list; we tailor the mix to the Client’s needs and adjust it as those needs change. As an initial priority, ONYX will also perform catch-up and clean-up work to bring the Client’s 2024 and 2025 books current and review-ready.</w:t>
+        <w:t>ONYX works as an extension of the Client’s accounting team — bringing controller-level oversight and review readiness without the cost and overhead of building it in-house. On a periodic basis (generally quarterly) and as otherwise needed or requested, ONYX supports the Client’s in-house bookkeeping, keeps the books in QuickBooks accurate and review-ready, helps stand up reporting by product line, and prepares the Client for its annual financial-statement review. The services below are illustrative of what ONYX provides and are not a fixed or exhaustive list; we tailor the mix to the Client’s needs and adjust it as those needs change. As an initial priority, ONYX will help compile the reports and supporting documentation needed to finalize the 2024 review, and perform catch-up and clean-up work to bring the 2025 books current and review-ready.</w:t>
       </w:r>
     </w:p>
     <w:p>
@@ -1063,7 +1063,7 @@
       </w:pPr>
       <w:r>
         <w:rPr/>
-        <w:t>Perform catch-up and clean-up accounting for the 2024 and 2025 periods to bring the books current and ready for review</w:t>
+        <w:t>Compile the reports and supporting documentation needed to finalize 2024, and perform catch-up and clean-up accounting to bring the 2025 books current and review-ready</w:t>
       </w:r>
     </w:p>
     <w:p>

</xml_diff>

<commit_message>
Right-size 'How we'll work together' to the actual scope
The granular per-transaction approval list assumed ONYX executes AP,
payroll, wires, and card spend (the full cash-access model). This
engagement is periodic oversight, reconciliation review, and review
readiness, so consolidated the eight bullets into four: provide access,
provide timely info/point of contact, Client retains approval authority
over its own transactions, and review/approve bank recs.

Co-Authored-By: Claude Opus 4.8 <noreply@anthropic.com>
Claude-Session: https://claude.ai/code/session_01RfN2m1kgBo1xCWLXRNw2zV
</commit_message>
<xml_diff>
--- a/Onyx_Engagement_Letter_Korer_HOURLY.docx
+++ b/Onyx_Engagement_Letter_Korer_HOURLY.docx
@@ -1296,11 +1296,7 @@
       </w:pPr>
       <w:r>
         <w:rPr/>
-        <w:t>Approve all invoices and check payments</w:t>
-      </w:r>
-      <w:r>
-        <w:rPr/>
-        <w:t>.</w:t>
+        <w:t>Provide ONYX with timely access to QuickBooks, bank and credit-card statements, and the records and documentation requested for the annual review.</w:t>
       </w:r>
     </w:p>
     <w:p>
@@ -1317,11 +1313,7 @@
       </w:pPr>
       <w:r>
         <w:rPr/>
-        <w:t>Approve all new vendors and customers added to the accounting system</w:t>
-      </w:r>
-      <w:r>
-        <w:rPr/>
-        <w:t>.</w:t>
+        <w:t>Provide timely, accurate information and a primary point of contact so the books stay current and the annual review stays on track.</w:t>
       </w:r>
     </w:p>
     <w:p>
@@ -1338,11 +1330,7 @@
       </w:pPr>
       <w:r>
         <w:rPr/>
-        <w:t>Approve all wire transfers to external parties</w:t>
-      </w:r>
-      <w:r>
-        <w:rPr/>
-        <w:t>.</w:t>
+        <w:t>Retain approval authority and internal control over the Client’s own transactions — including invoices and payments, new vendors and customers, wire transfers, payroll changes, and credit-card expenses.</w:t>
       </w:r>
     </w:p>
     <w:p>
@@ -1359,85 +1347,7 @@
       </w:pPr>
       <w:r>
         <w:rPr/>
-        <w:t xml:space="preserve">Approve all new employees and employee status changes before they are entered into the payroll system.</w:t>
-      </w:r>
-    </w:p>
-    <w:p>
-      <w:pPr>
-        <w:pStyle w:val="CLALTRNormal"/>
-        <w:numPr>
-          <w:ilvl w:val="0"/>
-          <w:numId w:val="21"/>
-        </w:numPr>
-        <w:jc w:val="both"/>
-        <w:rPr>
-          <w:highlight w:val="yellow"/>
-        </w:rPr>
-      </w:pPr>
-      <w:r>
-        <w:rPr/>
-        <w:t xml:space="preserve">Approve all credit card statements before those expenses are processed and paid.</w:t>
-      </w:r>
-    </w:p>
-    <w:p>
-      <w:pPr>
-        <w:pStyle w:val="CLALTRNormal"/>
-        <w:numPr>
-          <w:ilvl w:val="0"/>
-          <w:numId w:val="21"/>
-        </w:numPr>
-        <w:jc w:val="both"/>
-        <w:rPr>
-          <w:highlight w:val="yellow"/>
-        </w:rPr>
-      </w:pPr>
-      <w:r>
-        <w:rPr/>
-        <w:t xml:space="preserve">Approve (or delegate to the </w:t>
-      </w:r>
-      <w:r>
-        <w:rPr/>
-        <w:t>ONYX</w:t>
-      </w:r>
-      <w:r>
-        <w:rPr/>
-        <w:t xml:space="preserve"> controller if applicable) all customer and vendor credit memos and accounts receivable amounts written off.</w:t>
-      </w:r>
-    </w:p>
-    <w:p>
-      <w:pPr>
-        <w:pStyle w:val="CLALTRNormal"/>
-        <w:numPr>
-          <w:ilvl w:val="0"/>
-          <w:numId w:val="21"/>
-        </w:numPr>
-        <w:jc w:val="both"/>
-      </w:pPr>
-      <w:r>
-        <w:rPr/>
-        <w:t xml:space="preserve">Review and approve (or delegate to the </w:t>
-      </w:r>
-      <w:r>
-        <w:rPr/>
-        <w:t>ONYX</w:t>
-      </w:r>
-      <w:r>
-        <w:rPr/>
-        <w:t xml:space="preserve"> controller if applicable) all bank statements and affiliated monthly reconciliations.</w:t>
-      </w:r>
-    </w:p>
-    <w:p>
-      <w:pPr>
-        <w:pStyle w:val="CLALTRNormal"/>
-        <w:numPr>
-          <w:ilvl w:val="0"/>
-          <w:numId w:val="21"/>
-        </w:numPr>
-        <w:jc w:val="both"/>
-      </w:pPr>
-      <w:r>
-        <w:rPr/>
-        <w:t>Provide ONYX with timely access to QuickBooks, bank and credit-card statements, and the records and documentation requested for the annual review.</w:t>
+        <w:t>Review and approve (or delegate to the ONYX controller if applicable) bank statements and the related monthly reconciliations.</w:t>
       </w:r>
     </w:p>
     <w:p>

</xml_diff>

<commit_message>
Make scope/fee changes email-confirmable; drop signature/addendum
Relaxed the three amendment clauses (opening evergreen clause,
'Adjusting your services,' and the service-commitment paragraph) so
changes take effect when confirmed in writing, including by email, with
no signature, formal addendum, or re-execution required. Keeps a written
trail for fee changes while supporting a fluid engagement.

Co-Authored-By: Claude Opus 4.8 <noreply@anthropic.com>
Claude-Session: https://claude.ai/code/session_01RfN2m1kgBo1xCWLXRNw2zV
</commit_message>
<xml_diff>
--- a/Onyx_Engagement_Letter_Korer_HOURLY.docx
+++ b/Onyx_Engagement_Letter_Korer_HOURLY.docx
@@ -531,250 +531,10 @@
         <w:jc w:val="both"/>
       </w:pPr>
       <w:r>
-        <w:t>We appreciate your decision to retain Onyx Accounting Group, LLC (“ONYX”</w:t>
-      </w:r>
-      <w:r>
-        <w:t xml:space="preserve">, “we”, </w:t>
-      </w:r>
-      <w:r>
-        <w:t>and/or “us” – as the context requires</w:t>
-      </w:r>
-      <w:r>
-        <w:t xml:space="preserve">). </w:t>
-      </w:r>
-      <w:r>
-        <w:t xml:space="preserve">This letter </w:t>
-      </w:r>
-      <w:r>
-        <w:t xml:space="preserve">states </w:t>
-      </w:r>
-      <w:r>
-        <w:t xml:space="preserve">the terms and objectives of </w:t>
-      </w:r>
-      <w:r>
-        <w:t>ONYX’s</w:t>
-      </w:r>
-      <w:r>
-        <w:t xml:space="preserve"> </w:t>
-      </w:r>
-      <w:r>
-        <w:t xml:space="preserve">engagement and the nature and limitations of the services </w:t>
-      </w:r>
-      <w:r>
-        <w:t>Onyx</w:t>
-      </w:r>
-      <w:r>
-        <w:t xml:space="preserve"> will provide for </w:t>
-      </w:r>
-      <w:r>
-        <w:fldChar w:fldCharType="begin">
-          <w:ffData>
-            <w:name w:val="Text46"/>
-            <w:enabled/>
-            <w:calcOnExit w:val="0"/>
-            <w:textInput>
-              <w:default w:val="[Client Name]"/>
-            </w:textInput>
-          </w:ffData>
-        </w:fldChar>
-      </w:r>
-      <w:r>
-        <w:instrText xml:space="preserve"> FORMTEXT </w:instrText>
-      </w:r>
-      <w:r>
-        <w:fldChar w:fldCharType="separate"/>
-      </w:r>
-      <w:r>
-        <w:rPr>
-          <w:noProof/>
-        </w:rPr>
-        <w:t>Korman LLC</w:t>
-      </w:r>
-      <w:r>
-        <w:fldChar w:fldCharType="end"/>
-      </w:r>
-      <w:r>
-        <w:t xml:space="preserve"> (“</w:t>
-      </w:r>
-      <w:r>
-        <w:t>the Client</w:t>
-      </w:r>
-      <w:r>
-        <w:t>”</w:t>
-      </w:r>
-      <w:r>
-        <w:t xml:space="preserve">, “you”, and/or “your” – as </w:t>
-      </w:r>
-      <w:r>
-        <w:t>the context requires</w:t>
-      </w:r>
-      <w:r>
-        <w:t xml:space="preserve">) </w:t>
-      </w:r>
-      <w:r>
-        <w:t xml:space="preserve">starting in </w:t>
-      </w:r>
-      <w:r>
-        <w:fldChar w:fldCharType="begin">
-          <w:ffData>
-            <w:name w:val="Text27"/>
-            <w:enabled/>
-            <w:calcOnExit w:val="0"/>
-            <w:textInput>
-              <w:default w:val="[period OR year]"/>
-            </w:textInput>
-          </w:ffData>
-        </w:fldChar>
-      </w:r>
-      <w:r>
-        <w:instrText xml:space="preserve"> FORMTEXT </w:instrText>
-      </w:r>
-      <w:r>
-        <w:fldChar w:fldCharType="separate"/>
-      </w:r>
-      <w:r>
-        <w:rPr>
-          <w:noProof/>
-        </w:rPr>
-        <w:t>2026</w:t>
-      </w:r>
-      <w:r>
-        <w:fldChar w:fldCharType="end"/>
-      </w:r>
-      <w:r>
-        <w:t xml:space="preserve"> </w:t>
-      </w:r>
-      <w:r>
-        <w:t>for the</w:t>
-      </w:r>
-      <w:r>
-        <w:t xml:space="preserve"> fiscal year</w:t>
-      </w:r>
-      <w:r>
-        <w:t xml:space="preserve"> end</w:t>
-      </w:r>
-      <w:r>
-        <w:t>ing</w:t>
-      </w:r>
-      <w:r>
-        <w:t xml:space="preserve"> </w:t>
+        <w:t>We appreciate your decision to retain Onyx Accounting Group, LLC (“ONYX”, “we”, and/or “us” – as the context requires). This letter states the terms and objectives of ONYX’s engagement and the nature and limitations of the services Onyx will provide for Korman LLC (“the Client”, “you”, and/or “your” – as the context requires) starting in 2026 for the fiscal year ending December 31, 2026 (the “Initial Period”). The terms of our engagement will apply to the Initial Period, and all subsequent periods, unless the terms of our engagement are changed in a written communication, including by email, agreed to by both ONYX and the Client.</w:t>
       </w:r>
       <w:bookmarkStart w:id="6" w:name="Text47"/>
-      <w:r>
-        <w:fldChar w:fldCharType="begin">
-          <w:ffData>
-            <w:name w:val="Text47"/>
-            <w:enabled/>
-            <w:calcOnExit w:val="0"/>
-            <w:textInput>
-              <w:default w:val="[Year-end Date]"/>
-            </w:textInput>
-          </w:ffData>
-        </w:fldChar>
-      </w:r>
-      <w:r>
-        <w:instrText xml:space="preserve"> FORMTEXT </w:instrText>
-      </w:r>
-      <w:r>
-        <w:fldChar w:fldCharType="separate"/>
-      </w:r>
-      <w:r>
-        <w:rPr>
-          <w:noProof/>
-        </w:rPr>
-        <w:t>December 31, 2026</w:t>
-      </w:r>
-      <w:r>
-        <w:fldChar w:fldCharType="end"/>
-      </w:r>
       <w:bookmarkEnd w:id="6"/>
-      <w:r>
-        <w:t xml:space="preserve"> (the “Initial Period”)</w:t>
-      </w:r>
-      <w:r>
-        <w:t xml:space="preserve">. The terms of our engagement </w:t>
-      </w:r>
-      <w:r>
-        <w:rPr>
-          <w:b/>
-        </w:rPr>
-        <w:t xml:space="preserve">will apply to the </w:t>
-      </w:r>
-      <w:r>
-        <w:rPr>
-          <w:b/>
-        </w:rPr>
-        <w:t>I</w:t>
-      </w:r>
-      <w:r>
-        <w:rPr>
-          <w:b/>
-        </w:rPr>
-        <w:t>nitial</w:t>
-      </w:r>
-      <w:r>
-        <w:rPr>
-          <w:b/>
-        </w:rPr>
-        <w:t xml:space="preserve"> Period</w:t>
-      </w:r>
-      <w:r>
-        <w:rPr>
-          <w:b/>
-        </w:rPr>
-        <w:t>,</w:t>
-      </w:r>
-      <w:r>
-        <w:rPr>
-          <w:b/>
-        </w:rPr>
-        <w:t xml:space="preserve"> and all subsequent </w:t>
-      </w:r>
-      <w:r>
-        <w:rPr>
-          <w:b/>
-        </w:rPr>
-        <w:t>periods</w:t>
-      </w:r>
-      <w:r>
-        <w:rPr>
-          <w:b/>
-        </w:rPr>
-        <w:t xml:space="preserve">, unless the </w:t>
-      </w:r>
-      <w:r>
-        <w:rPr>
-          <w:b/>
-        </w:rPr>
-        <w:t>terms of our engagement are</w:t>
-      </w:r>
-      <w:r>
-        <w:rPr>
-          <w:b/>
-        </w:rPr>
-        <w:t xml:space="preserve"> changed in a </w:t>
-      </w:r>
-      <w:r>
-        <w:rPr>
-          <w:b/>
-        </w:rPr>
-        <w:t xml:space="preserve">written </w:t>
-      </w:r>
-      <w:r>
-        <w:rPr>
-          <w:b/>
-        </w:rPr>
-        <w:t xml:space="preserve">communication </w:t>
-      </w:r>
-      <w:r>
-        <w:rPr>
-          <w:b/>
-        </w:rPr>
-        <w:t>signed by both ONYX and the Client</w:t>
-      </w:r>
-      <w:r>
-        <w:t>.</w:t>
-      </w:r>
     </w:p>
     <w:p>
       <w:pPr>
@@ -1257,7 +1017,7 @@
         <w:jc w:val="both"/>
       </w:pPr>
       <w:r>
-        <w:t xml:space="preserve">Your needs will evolve as your business grows, and this engagement is built to flex with them. Services can be added, reduced, or adjusted at any time by mutual written agreement — typically a brief addendum to this letter rather than a new engagement letter — with fees adjusted accordingly. All other terms of this agreement remain in effect, so adding or removing a service never requires starting over.</w:t>
+        <w:t>Your needs will evolve as your business grows, and this engagement is built to flex with them. Services can be added, reduced, or adjusted at any time by mutual written agreement — including by email, with no formal addendum or new engagement letter required — with fees adjusted accordingly. All other terms of this agreement remain in effect, so adding or removing a service never requires starting over.</w:t>
       </w:r>
     </w:p>
     <w:p>
@@ -2278,7 +2038,7 @@
         <w:jc w:val="both"/>
       </w:pPr>
       <w:r>
-        <w:t xml:space="preserve">To ensure that ONYX’s services remain responsive to the Client’s needs, and fair to both parties, ONYX will meet with the Client throughout the term of this agreement and, as needs change, revise or adjust the scope of services and the related fees — without the need to re-execute this agreement. Such revisions or adjustments are not binding unless made in writing and signed by both ONYX and the Client.</w:t>
+        <w:t>To ensure that ONYX’s services remain responsive to the Client’s needs, and fair to both parties, ONYX will meet with the Client throughout the term of this agreement and, as needs change, revise or adjust the scope of services and the related fees — without the need to re-execute this agreement. Such revisions or adjustments take effect once confirmed in writing, including by email, by both ONYX and the Client; no signature, formal addendum, or re-execution of this agreement is required.</w:t>
       </w:r>
     </w:p>
     <w:p>

</xml_diff>